<commit_message>
docs: completar documentacion base de pruebas instalacion y riesgos
</commit_message>
<xml_diff>
--- a/documentacion/word/RecepcionElectronica/MI-RE-001-Instalacion.docx
+++ b/documentacion/word/RecepcionElectronica/MI-RE-001-Instalacion.docx
@@ -416,6 +416,144 @@
       </w:pPr>
       <w:r/>
       <w:r>
+        <w:t>Contenido</w:t>
+      </w:r>
+    </w:p>
+    <w:p>
+      <w:pPr>
+        <w:pStyle w:val="ListNumber"/>
+      </w:pPr>
+      <w:r>
+        <w:t>Requisitos previos</w:t>
+      </w:r>
+    </w:p>
+    <w:p>
+      <w:pPr>
+        <w:pStyle w:val="ListNumber"/>
+      </w:pPr>
+      <w:r>
+        <w:t>Instalación desde cero</w:t>
+      </w:r>
+    </w:p>
+    <w:p>
+      <w:pPr>
+        <w:pStyle w:val="ListNumber"/>
+      </w:pPr>
+      <w:r>
+        <w:t>Variables de entorno</w:t>
+      </w:r>
+    </w:p>
+    <w:p>
+      <w:pPr>
+        <w:pStyle w:val="ListNumber"/>
+      </w:pPr>
+      <w:r>
+        <w:t>Actualización</w:t>
+      </w:r>
+    </w:p>
+    <w:p>
+      <w:pPr>
+        <w:pStyle w:val="ListNumber"/>
+      </w:pPr>
+      <w:r>
+        <w:t>Flujo manual</w:t>
+      </w:r>
+    </w:p>
+    <w:p>
+      <w:pPr>
+        <w:pStyle w:val="ListNumber"/>
+      </w:pPr>
+      <w:r>
+        <w:t>Operación con PM2</w:t>
+      </w:r>
+    </w:p>
+    <w:p>
+      <w:pPr>
+        <w:pStyle w:val="ListNumber"/>
+      </w:pPr>
+      <w:r>
+        <w:t>HTTPS</w:t>
+      </w:r>
+    </w:p>
+    <w:p>
+      <w:pPr>
+        <w:pStyle w:val="ListNumber"/>
+      </w:pPr>
+      <w:r>
+        <w:t>Scripts disponibles</w:t>
+      </w:r>
+    </w:p>
+    <w:p>
+      <w:pPr>
+        <w:pStyle w:val="ListNumber"/>
+      </w:pPr>
+      <w:r>
+        <w:t>Verificación post-despliegue</w:t>
+      </w:r>
+    </w:p>
+    <w:p>
+      <w:pPr>
+        <w:pStyle w:val="ListNumber"/>
+      </w:pPr>
+      <w:r>
+        <w:t>Respaldo y recuperación</w:t>
+      </w:r>
+    </w:p>
+    <w:p>
+      <w:pPr>
+        <w:pStyle w:val="ListNumber"/>
+      </w:pPr>
+      <w:r>
+        <w:t>Control documental</w:t>
+      </w:r>
+    </w:p>
+    <w:p>
+      <w:pPr>
+        <w:pStyle w:val="Heading2"/>
+      </w:pPr>
+      <w:r/>
+      <w:r>
+        <w:t>Contenido de imágenes</w:t>
+      </w:r>
+    </w:p>
+    <w:p>
+      <w:pPr>
+        <w:pStyle w:val="ListBullet"/>
+      </w:pPr>
+      <w:r>
+        <w:t>Ilustración 1. Verificación de versiones (node, npm, mongod)</w:t>
+      </w:r>
+    </w:p>
+    <w:p>
+      <w:pPr>
+        <w:pStyle w:val="ListBullet"/>
+      </w:pPr>
+      <w:r>
+        <w:t>Ilustración 2. Ejecución exitosa de setup.ps1</w:t>
+      </w:r>
+    </w:p>
+    <w:p>
+      <w:pPr>
+        <w:pStyle w:val="ListBullet"/>
+      </w:pPr>
+      <w:r>
+        <w:t>Ilustración 3. Salida de pm2 list con el proceso back en línea</w:t>
+      </w:r>
+    </w:p>
+    <w:p>
+      <w:pPr>
+        <w:pStyle w:val="ListBullet"/>
+      </w:pPr>
+      <w:r>
+        <w:t>Ilustración 4. Pantalla de login tras el despliegue</w:t>
+      </w:r>
+    </w:p>
+    <w:p>
+      <w:pPr>
+        <w:pStyle w:val="Heading2"/>
+      </w:pPr>
+      <w:r/>
+      <w:r>
         <w:t>1. Requisitos previos</w:t>
       </w:r>
     </w:p>
@@ -461,6 +599,17 @@
       </w:r>
     </w:p>
     <w:p>
+      <w:r>
+        <w:rPr>
+          <w:b/>
+        </w:rPr>
+        <w:t>Ilustración 1.</w:t>
+      </w:r>
+      <w:r>
+        <w:t xml:space="preserve"> Verificación de versiones (node, npm, mongod)</w:t>
+      </w:r>
+    </w:p>
+    <w:p>
       <w:pPr>
         <w:pStyle w:val="Heading2"/>
       </w:pPr>
@@ -499,6 +648,17 @@
           <w:color w:val="C7254E"/>
         </w:rPr>
         <w:t>[Foto: ejecución exitosa de setup.ps1]</w:t>
+      </w:r>
+    </w:p>
+    <w:p>
+      <w:r>
+        <w:rPr>
+          <w:b/>
+        </w:rPr>
+        <w:t>Ilustración 2.</w:t>
+      </w:r>
+      <w:r>
+        <w:t xml:space="preserve"> Ejecución exitosa de setup.ps1</w:t>
       </w:r>
     </w:p>
     <w:p>
@@ -1009,6 +1169,17 @@
       </w:r>
     </w:p>
     <w:p>
+      <w:r>
+        <w:rPr>
+          <w:b/>
+        </w:rPr>
+        <w:t>Ilustración 3.</w:t>
+      </w:r>
+      <w:r>
+        <w:t xml:space="preserve"> Salida de pm2 list con el proceso back en línea</w:t>
+      </w:r>
+    </w:p>
+    <w:p>
       <w:pPr>
         <w:pStyle w:val="Heading2"/>
       </w:pPr>
@@ -1388,6 +1559,17 @@
       </w:r>
     </w:p>
     <w:p>
+      <w:r>
+        <w:rPr>
+          <w:b/>
+        </w:rPr>
+        <w:t>Ilustración 4.</w:t>
+      </w:r>
+      <w:r>
+        <w:t xml:space="preserve"> Pantalla de login tras el despliegue</w:t>
+      </w:r>
+    </w:p>
+    <w:p>
       <w:pPr>
         <w:pStyle w:val="Heading2"/>
       </w:pPr>

</xml_diff>